<commit_message>
resume v4 (i resume pub)
</commit_message>
<xml_diff>
--- a/Sean_Patten_Resume.docx
+++ b/Sean_Patten_Resume.docx
@@ -162,18 +162,6 @@
           <w:t>[Code]</w:t>
         </w:r>
       </w:hyperlink>
-    </w:p>
-    <w:p>
-      <w:pPr>
-        <w:spacing w:after="100"/>
-      </w:pPr>
-      <w:r>
-        <w:rPr>
-          <w:b w:val="0"/>
-          <w:i w:val="0"/>
-        </w:rPr>
-        <w:t xml:space="preserve">Xu, J., Wu, Y., Chen, S. Y.-C., Patten, S., Schweikert, C., &amp; Hsu, D.F. (2026). Diversity-Aware Ensemble of Quantum-Classical Models via Combinatorial Fusion. Proceedings of the IEEE International Conference on Quantum Computing and Engineering (QCE 2026), Quantum Applications track, Toronto (accepted, not yet published). </w:t>
-      </w:r>
     </w:p>
     <w:p>
       <w:r>
@@ -371,108 +359,6 @@
           <w:i w:val="0"/>
         </w:rPr>
         <w:t>Developed predictive models for aircraft part failure and automated internal document generation systems using Python and LLMs.</w:t>
-      </w:r>
-    </w:p>
-    <w:p>
-      <w:pPr>
-        <w:keepNext/>
-        <w:tabs>
-          <w:tab w:pos="10080" w:val="right"/>
-        </w:tabs>
-        <w:spacing w:before="100" w:after="40"/>
-      </w:pPr>
-      <w:r>
-        <w:rPr>
-          <w:b/>
-          <w:i w:val="0"/>
-          <w:sz w:val="22"/>
-        </w:rPr>
-        <w:t>Quantum Computing Researcher, Fujitsu Quantum Simulator Challenge</w:t>
-      </w:r>
-      <w:r>
-        <w:rPr>
-          <w:b w:val="0"/>
-          <w:i/>
-          <w:color w:val="444444"/>
-          <w:sz w:val="19"/>
-        </w:rPr>
-        <w:tab/>
-        <w:t>January 2026 - Present</w:t>
-      </w:r>
-    </w:p>
-    <w:p>
-      <w:pPr>
-        <w:pStyle w:val="ListBullet"/>
-      </w:pPr>
-      <w:r>
-        <w:rPr>
-          <w:b w:val="0"/>
-          <w:i w:val="0"/>
-        </w:rPr>
-        <w:t>First author of the Asia University team's accepted proposal (Q-Compress: Variational Entanglement Profiling for Extreme LLM Compression); currently running LLM weight-compression experiments on Fujitsu's 40-qubit tensor network simulator, a 1,024-node FX700 (A64FX) supercomputer cluster, via the QARP SDK and Qulacs.</w:t>
-      </w:r>
-    </w:p>
-    <w:p>
-      <w:pPr>
-        <w:pStyle w:val="ListBullet"/>
-      </w:pPr>
-      <w:r>
-        <w:rPr>
-          <w:b w:val="0"/>
-          <w:i w:val="0"/>
-        </w:rPr>
-        <w:t>Maps transformer weight super-blocks onto qubit registers and uses entanglement profiling (Von Neumann entropy across bipartitions) to derive non-uniform, entropy-aware tensor-network compression topologies, targeting 80%+ memory reduction with under 2% accuracy loss against SVD-LLM, ASVD, SparseGPT, and CompactifAI baselines.</w:t>
-      </w:r>
-    </w:p>
-    <w:p>
-      <w:pPr>
-        <w:keepNext/>
-        <w:tabs>
-          <w:tab w:pos="10080" w:val="right"/>
-        </w:tabs>
-        <w:spacing w:before="100" w:after="40"/>
-      </w:pPr>
-      <w:r>
-        <w:rPr>
-          <w:b/>
-          <w:i w:val="0"/>
-          <w:sz w:val="22"/>
-        </w:rPr>
-        <w:t>Research Team Lead, Laboratory of Informatics and Data Mining, Fordham</w:t>
-      </w:r>
-      <w:r>
-        <w:rPr>
-          <w:b w:val="0"/>
-          <w:i/>
-          <w:color w:val="444444"/>
-          <w:sz w:val="19"/>
-        </w:rPr>
-        <w:tab/>
-        <w:t>2026 - Present</w:t>
-      </w:r>
-    </w:p>
-    <w:p>
-      <w:pPr>
-        <w:pStyle w:val="ListBullet"/>
-      </w:pPr>
-      <w:r>
-        <w:rPr>
-          <w:b w:val="0"/>
-          <w:i w:val="0"/>
-        </w:rPr>
-        <w:t>Led the research team (Fordham LIDM students with Dr. Samuel Yen-Chi Chen, first author of the original QLSTM paper) building a reproducible quantum-classical Combinatorial Fusion Analysis pipeline: a 40-model pool of 26 quantum-circuit feature maps (including gradient-trained variational quantum classifiers) and 14 classical baselines, with cognitive-diversity-based model selection.</w:t>
-      </w:r>
-    </w:p>
-    <w:p>
-      <w:pPr>
-        <w:pStyle w:val="ListBullet"/>
-      </w:pPr>
-      <w:r>
-        <w:rPr>
-          <w:b w:val="0"/>
-          <w:i w:val="0"/>
-        </w:rPr>
-        <w:t>Work produced the accepted paper Diversity-Aware Ensemble of Quantum-Classical Models via Combinatorial Fusion (QCE 2026).</w:t>
       </w:r>
     </w:p>
     <w:p>
@@ -1188,6 +1074,137 @@
         <w:t>Helped Fordham students learn practical digital skills. Held events on learning Python, personally teaching the basics to beginners, and increased attendance by over 1,000% compared to previous years.</w:t>
       </w:r>
     </w:p>
+    <w:p>
+      <w:pPr>
+        <w:keepNext/>
+        <w:pBdr>
+          <w:bottom w:val="single" w:sz="12" w:color="0056B3" w:space="2"/>
+        </w:pBdr>
+        <w:spacing w:before="180" w:after="60"/>
+      </w:pPr>
+      <w:r>
+        <w:rPr>
+          <w:b/>
+          <w:i w:val="0"/>
+          <w:sz w:val="25"/>
+        </w:rPr>
+        <w:t>QUANTUM COMPUTING</w:t>
+      </w:r>
+    </w:p>
+    <w:p>
+      <w:pPr>
+        <w:spacing w:after="100"/>
+      </w:pPr>
+      <w:r>
+        <w:rPr>
+          <w:b w:val="0"/>
+          <w:i w:val="0"/>
+        </w:rPr>
+        <w:t xml:space="preserve">Xu, J., Wu, Y., Chen, S. Y.-C., Patten, S., Schweikert, C., &amp; Hsu, D.F. (2026). Diversity-Aware Ensemble of Quantum-Classical Models via Combinatorial Fusion. Proceedings of the IEEE International Conference on Quantum Computing and Engineering (QCE 2026), Quantum Applications track, Toronto (accepted, not yet published). </w:t>
+      </w:r>
+    </w:p>
+    <w:p>
+      <w:pPr>
+        <w:keepNext/>
+        <w:tabs>
+          <w:tab w:pos="10080" w:val="right"/>
+        </w:tabs>
+        <w:spacing w:before="100" w:after="40"/>
+      </w:pPr>
+      <w:r>
+        <w:rPr>
+          <w:b/>
+          <w:i w:val="0"/>
+          <w:sz w:val="22"/>
+        </w:rPr>
+        <w:t>Quantum Computing Researcher, Fujitsu Quantum Simulator Challenge</w:t>
+      </w:r>
+      <w:r>
+        <w:rPr>
+          <w:b w:val="0"/>
+          <w:i/>
+          <w:color w:val="444444"/>
+          <w:sz w:val="19"/>
+        </w:rPr>
+        <w:tab/>
+        <w:t>January 2026 - Present</w:t>
+      </w:r>
+    </w:p>
+    <w:p>
+      <w:pPr>
+        <w:pStyle w:val="ListBullet"/>
+      </w:pPr>
+      <w:r>
+        <w:rPr>
+          <w:b w:val="0"/>
+          <w:i w:val="0"/>
+        </w:rPr>
+        <w:t>First author of the Asia University team's accepted proposal (Q-Compress: Variational Entanglement Profiling for Extreme LLM Compression); currently running LLM weight-compression experiments on Fujitsu's 40-qubit tensor network simulator, a 1,024-node FX700 (A64FX) supercomputer cluster, via the QARP SDK and Qulacs.</w:t>
+      </w:r>
+    </w:p>
+    <w:p>
+      <w:pPr>
+        <w:pStyle w:val="ListBullet"/>
+      </w:pPr>
+      <w:r>
+        <w:rPr>
+          <w:b w:val="0"/>
+          <w:i w:val="0"/>
+        </w:rPr>
+        <w:t>Maps transformer weight super-blocks onto qubit registers and uses entanglement profiling (Von Neumann entropy across bipartitions) to derive non-uniform, entropy-aware tensor-network compression topologies, targeting 80%+ memory reduction with under 2% accuracy loss against SVD-LLM, ASVD, SparseGPT, and CompactifAI baselines.</w:t>
+      </w:r>
+    </w:p>
+    <w:p>
+      <w:pPr>
+        <w:keepNext/>
+        <w:tabs>
+          <w:tab w:pos="10080" w:val="right"/>
+        </w:tabs>
+        <w:spacing w:before="100" w:after="40"/>
+      </w:pPr>
+      <w:r>
+        <w:rPr>
+          <w:b/>
+          <w:i w:val="0"/>
+          <w:sz w:val="22"/>
+        </w:rPr>
+        <w:t>Research Team Lead, Laboratory of Informatics and Data Mining, Fordham</w:t>
+      </w:r>
+      <w:r>
+        <w:rPr>
+          <w:b w:val="0"/>
+          <w:i/>
+          <w:color w:val="444444"/>
+          <w:sz w:val="19"/>
+        </w:rPr>
+        <w:tab/>
+        <w:t>2026 - Present</w:t>
+      </w:r>
+    </w:p>
+    <w:p>
+      <w:pPr>
+        <w:pStyle w:val="ListBullet"/>
+      </w:pPr>
+      <w:r>
+        <w:rPr>
+          <w:b w:val="0"/>
+          <w:i w:val="0"/>
+        </w:rPr>
+        <w:t>Led the research team (Fordham LIDM students with Dr. Samuel Yen-Chi Chen, first author of the original QLSTM paper) building a reproducible quantum-classical Combinatorial Fusion Analysis pipeline: a 40-model pool of 26 quantum-circuit feature maps (including gradient-trained variational quantum classifiers) and 14 classical baselines, with cognitive-diversity-based model selection.</w:t>
+      </w:r>
+    </w:p>
+    <w:p>
+      <w:pPr>
+        <w:pStyle w:val="ListBullet"/>
+      </w:pPr>
+      <w:r>
+        <w:rPr>
+          <w:b w:val="0"/>
+          <w:i w:val="0"/>
+        </w:rPr>
+        <w:t>Work produced the accepted paper Diversity-Aware Ensemble of Quantum-Classical Models via Combinatorial Fusion (QCE 2026).</w:t>
+      </w:r>
+    </w:p>
     <w:sectPr>
       <w:pgSz w:w="12240" w:h="15840"/>
       <w:pgMar w:top="792" w:right="1080" w:bottom="792" w:left="1080" w:header="720" w:footer="720" w:gutter="0"/>

</xml_diff>

<commit_message>
resume v5 (i resume pub)
</commit_message>
<xml_diff>
--- a/Sean_Patten_Resume.docx
+++ b/Sean_Patten_Resume.docx
@@ -128,55 +128,16 @@
           <w:i w:val="0"/>
           <w:sz w:val="25"/>
         </w:rPr>
-        <w:t>PUBLICATIONS</w:t>
+        <w:t>PROFESSIONAL SUMMARY</w:t>
       </w:r>
     </w:p>
     <w:p>
-      <w:pPr>
-        <w:spacing w:after="100"/>
-      </w:pPr>
       <w:r>
         <w:rPr>
           <w:b w:val="0"/>
           <w:i w:val="0"/>
         </w:rPr>
-        <w:t xml:space="preserve">Patten, S., Chen, P.-Y., Schweikert, C., &amp; Hsu, D.F. (2025). Enhancing Sentiment Classification with Machine Learning and Combinatorial Fusion. Proceedings of the 23rd IEEE International Conference on Pervasive Intelligence and Computing (PICom 2025). </w:t>
-      </w:r>
-      <w:hyperlink r:id="rId13">
-        <w:r>
-          <w:rPr>
-            <w:b w:val="0"/>
-            <w:i w:val="0"/>
-            <w:color w:val="0056B3"/>
-          </w:rPr>
-          <w:t xml:space="preserve">[Link] </w:t>
-        </w:r>
-      </w:hyperlink>
-      <w:hyperlink r:id="rId14">
-        <w:r>
-          <w:rPr>
-            <w:b w:val="0"/>
-            <w:i w:val="0"/>
-            <w:color w:val="0056B3"/>
-          </w:rPr>
-          <w:t>[Code]</w:t>
-        </w:r>
-      </w:hyperlink>
-    </w:p>
-    <w:p>
-      <w:r>
-        <w:rPr>
-          <w:b/>
-          <w:i w:val="0"/>
-        </w:rPr>
-        <w:t xml:space="preserve">Erdős Number: </w:t>
-      </w:r>
-      <w:r>
-        <w:rPr>
-          <w:b w:val="0"/>
-          <w:i w:val="0"/>
-        </w:rPr>
-        <w:t>2 (via Dr. D. F. Hsu)</w:t>
+        <w:t>Machine learning researcher and systems engineer with peer-reviewed IEEE publications on ensemble learning and combinatorial fusion, including state-of-the-art sentiment classification research at IBM. Designs and operates production AI-agent infrastructure used daily: a multi-device agent fleet platform with automated review gates, sub-millisecond C tooling, and an unattended trading system running with personal capital. M.S. in Computer Science, Fordham University.</w:t>
       </w:r>
     </w:p>
     <w:p>
@@ -285,6 +246,57 @@
           <w:i w:val="0"/>
           <w:sz w:val="22"/>
         </w:rPr>
+        <w:t>Member, Laboratory for Informatics and Data Mining (Dr. D. F. Hsu), Fordham</w:t>
+      </w:r>
+      <w:r>
+        <w:rPr>
+          <w:b w:val="0"/>
+          <w:i/>
+          <w:color w:val="444444"/>
+          <w:sz w:val="19"/>
+        </w:rPr>
+        <w:tab/>
+        <w:t>2024 - Present</w:t>
+      </w:r>
+    </w:p>
+    <w:p>
+      <w:pPr>
+        <w:pStyle w:val="ListBullet"/>
+      </w:pPr>
+      <w:r>
+        <w:rPr>
+          <w:b w:val="0"/>
+          <w:i w:val="0"/>
+        </w:rPr>
+        <w:t>Fordham CIS research lab for machine learning, data mining, and information fusion, centered on combinatorial fusion analysis.</w:t>
+      </w:r>
+    </w:p>
+    <w:p>
+      <w:pPr>
+        <w:pStyle w:val="ListBullet"/>
+      </w:pPr>
+      <w:r>
+        <w:rPr>
+          <w:b w:val="0"/>
+          <w:i w:val="0"/>
+        </w:rPr>
+        <w:t>Research Team Lead (2026 - Jun 2026): led the research team (Fordham LIDM students with Dr. Samuel Yen-Chi Chen, first author of the original QLSTM paper) building a reproducible quantum-classical Combinatorial Fusion Analysis pipeline: a 40-model pool of 26 quantum-circuit feature maps (including gradient-trained variational quantum classifiers) and 14 classical baselines, with cognitive-diversity-based model selection; work produced the accepted QCE 2026 paper (see Publications).</w:t>
+      </w:r>
+    </w:p>
+    <w:p>
+      <w:pPr>
+        <w:keepNext/>
+        <w:tabs>
+          <w:tab w:pos="10080" w:val="right"/>
+        </w:tabs>
+        <w:spacing w:before="100" w:after="40"/>
+      </w:pPr>
+      <w:r>
+        <w:rPr>
+          <w:b/>
+          <w:i w:val="0"/>
+          <w:sz w:val="22"/>
+        </w:rPr>
         <w:t>Software Developer (Contract), Social Science Research Council</w:t>
       </w:r>
       <w:r>
@@ -336,7 +348,7 @@
           <w:i w:val="0"/>
           <w:sz w:val="22"/>
         </w:rPr>
-        <w:t>Consultant, Aspire Aviation</w:t>
+        <w:t>AI Engineer Consultant, Aspire Aviation</w:t>
       </w:r>
       <w:r>
         <w:rPr>
@@ -359,6 +371,95 @@
           <w:i w:val="0"/>
         </w:rPr>
         <w:t>Developed predictive models for aircraft part failure and automated internal document generation systems using Python and LLMs.</w:t>
+      </w:r>
+    </w:p>
+    <w:p>
+      <w:pPr>
+        <w:pStyle w:val="ListBullet"/>
+      </w:pPr>
+      <w:r>
+        <w:rPr>
+          <w:b w:val="0"/>
+          <w:i w:val="0"/>
+        </w:rPr>
+        <w:t>Constraint-based pilot crew scheduler in live operational use.</w:t>
+      </w:r>
+    </w:p>
+    <w:p>
+      <w:pPr>
+        <w:keepNext/>
+        <w:pBdr>
+          <w:bottom w:val="single" w:sz="12" w:color="0056B3" w:space="2"/>
+        </w:pBdr>
+        <w:spacing w:before="180" w:after="60"/>
+      </w:pPr>
+      <w:r>
+        <w:rPr>
+          <w:b/>
+          <w:i w:val="0"/>
+          <w:sz w:val="25"/>
+        </w:rPr>
+        <w:t>PUBLICATIONS</w:t>
+      </w:r>
+    </w:p>
+    <w:p>
+      <w:pPr>
+        <w:spacing w:after="100"/>
+      </w:pPr>
+      <w:r>
+        <w:rPr>
+          <w:b w:val="0"/>
+          <w:i w:val="0"/>
+        </w:rPr>
+        <w:t xml:space="preserve">Xu, J., Wu, Y., Chen, S. Y.-C., Patten, S., Schweikert, C., &amp; Hsu, D.F. (2026). Diversity-Aware Ensemble of Quantum-Classical Models via Combinatorial Fusion. Proceedings of the IEEE International Conference on Quantum Computing and Engineering (QCE 2026), Quantum Applications track, Toronto (accepted, not yet published). </w:t>
+      </w:r>
+    </w:p>
+    <w:p>
+      <w:pPr>
+        <w:spacing w:after="100"/>
+      </w:pPr>
+      <w:r>
+        <w:rPr>
+          <w:b w:val="0"/>
+          <w:i w:val="0"/>
+        </w:rPr>
+        <w:t xml:space="preserve">Patten, S., Chen, P.-Y., Schweikert, C., &amp; Hsu, D.F. (2025). Enhancing Sentiment Classification with Machine Learning and Combinatorial Fusion. Proceedings of the 23rd IEEE International Conference on Pervasive Intelligence and Computing (PICom 2025). </w:t>
+      </w:r>
+      <w:hyperlink r:id="rId13">
+        <w:r>
+          <w:rPr>
+            <w:b w:val="0"/>
+            <w:i w:val="0"/>
+            <w:color w:val="0056B3"/>
+          </w:rPr>
+          <w:t xml:space="preserve">[Link] </w:t>
+        </w:r>
+      </w:hyperlink>
+      <w:hyperlink r:id="rId14">
+        <w:r>
+          <w:rPr>
+            <w:b w:val="0"/>
+            <w:i w:val="0"/>
+            <w:color w:val="0056B3"/>
+          </w:rPr>
+          <w:t>[Code]</w:t>
+        </w:r>
+      </w:hyperlink>
+    </w:p>
+    <w:p>
+      <w:r>
+        <w:rPr>
+          <w:b/>
+          <w:i w:val="0"/>
+        </w:rPr>
+        <w:t xml:space="preserve">Erdős Number: </w:t>
+      </w:r>
+      <w:r>
+        <w:rPr>
+          <w:b w:val="0"/>
+          <w:i w:val="0"/>
+        </w:rPr>
+        <w:t>2 (via Dr. D. F. Hsu)</w:t>
       </w:r>
     </w:p>
     <w:p>
@@ -425,19 +526,14 @@
     </w:p>
     <w:p>
       <w:pPr>
-        <w:keepNext/>
-        <w:tabs>
-          <w:tab w:pos="10080" w:val="right"/>
-        </w:tabs>
-        <w:spacing w:before="100" w:after="40"/>
+        <w:pStyle w:val="ListBullet"/>
       </w:pPr>
       <w:r>
         <w:rPr>
-          <w:b/>
+          <w:b w:val="0"/>
           <w:i w:val="0"/>
-          <w:sz w:val="22"/>
         </w:rPr>
-        <w:t>i: personal operator system</w:t>
+        <w:t>Every interactive tool held to a 1.0 ms latency budget by a daily watchdog that PTY-measures cold render and per-keystroke repaint and emails on regression; per-tool ok/fail run logs and failure alerts across the fleet.</w:t>
       </w:r>
     </w:p>
     <w:p>
@@ -449,7 +545,43 @@
           <w:b w:val="0"/>
           <w:i w:val="0"/>
         </w:rPr>
-        <w:t>Integrated one-keypress system for the full operator loop (health tracking, market attention, research capture, and document generation, including this resume); 40+ tools with token-budget-gated builds.</w:t>
+        <w:t>C hot paths validated entry-for-entry against the reference Python implementation by a scripted byte-identical diff harness.</w:t>
+      </w:r>
+    </w:p>
+    <w:p>
+      <w:pPr>
+        <w:pStyle w:val="ListBullet"/>
+      </w:pPr>
+      <w:r>
+        <w:rPr>
+          <w:b w:val="0"/>
+          <w:i w:val="0"/>
+        </w:rPr>
+        <w:t>Prompt management as infrastructure: every agent launch composes git-versioned prompt files (system, project, and role layers); prompt edits are reviewed and diffed like code, with a human gate before adoption.</w:t>
+      </w:r>
+    </w:p>
+    <w:p>
+      <w:pPr>
+        <w:pStyle w:val="ListBullet"/>
+      </w:pPr>
+      <w:r>
+        <w:rPr>
+          <w:b w:val="0"/>
+          <w:i w:val="0"/>
+        </w:rPr>
+        <w:t>Agent evaluation beyond accuracy: anonymized multi-model judge panels (question to candidates to vote to mechanical tally) and independent two-model objection checks review outbound artifacts before anything ships.</w:t>
+      </w:r>
+    </w:p>
+    <w:p>
+      <w:pPr>
+        <w:pStyle w:val="ListBullet"/>
+      </w:pPr>
+      <w:r>
+        <w:rPr>
+          <w:b w:val="0"/>
+          <w:i w:val="0"/>
+        </w:rPr>
+        <w:t>Daily-use voice interface: microphone capture to Parakeet (sherpa-onnx) speech recognition to LLM to spoken TTS reply; fleet-wide dictation runs the same stack.</w:t>
       </w:r>
     </w:p>
     <w:p>
@@ -466,7 +598,36 @@
           <w:i w:val="0"/>
           <w:sz w:val="22"/>
         </w:rPr>
-        <w:t>SuperCowsay: cowsay rewritten in assembly for maximum performance</w:t>
+        <w:t>civ: offline full-text search over a civilization-scale corpus</w:t>
+      </w:r>
+    </w:p>
+    <w:p>
+      <w:pPr>
+        <w:pStyle w:val="ListBullet"/>
+      </w:pPr>
+      <w:r>
+        <w:rPr>
+          <w:b w:val="0"/>
+          <w:i w:val="0"/>
+        </w:rPr>
+        <w:t>~600 GB local corpus (Wikipedia, all 70,000 Project Gutenberg books, 2M arXiv papers) searchable in ~250 ms via a 47 GB SQLite FTS5 index; one-command source acquisition and indexing (C + Python).</w:t>
+      </w:r>
+    </w:p>
+    <w:p>
+      <w:pPr>
+        <w:keepNext/>
+        <w:tabs>
+          <w:tab w:pos="10080" w:val="right"/>
+        </w:tabs>
+        <w:spacing w:before="100" w:after="40"/>
+      </w:pPr>
+      <w:r>
+        <w:rPr>
+          <w:b/>
+          <w:i w:val="0"/>
+          <w:sz w:val="22"/>
+        </w:rPr>
+        <w:t>SuperCowsay: cowsay rewritten in assembly, at the Linux exec floor</w:t>
       </w:r>
     </w:p>
     <w:p>
@@ -494,7 +655,7 @@
           <w:b w:val="0"/>
           <w:i w:val="0"/>
         </w:rPr>
-        <w:t>75x faster than the original Perl and 2.4x faster than a C implementation (measured with hyperfine); syscall count reduced from 676 to 2.</w:t>
+        <w:t>629-byte hand-written ELF (assembler emits the executable directly, no linker): runs 1.3 microseconds above the kernel's process-spawn floor, measured against an exit-only binary, at 2 syscalls and 145x the original Perl; a second build is byte-identical to the Perl original across 344 differential-fuzz cases (stdout, stderr, exit code) at 35.7x its speed. All rows measured in one pinned hyperfine session.</w:t>
       </w:r>
     </w:p>
     <w:p>
@@ -669,7 +830,19 @@
           <w:b w:val="0"/>
           <w:i w:val="0"/>
         </w:rPr>
-        <w:t>In production with real capital; proprietary and cannot be shown or described in detail.</w:t>
+        <w:t>Automated market scanning, armed alert watches, pre-queued order workflows, and an append-only audit log of every action (C + Python), running unattended across a self-managed multi-device fleet; in production with personal capital.</w:t>
+      </w:r>
+    </w:p>
+    <w:p>
+      <w:pPr>
+        <w:pStyle w:val="ListBullet"/>
+      </w:pPr>
+      <w:r>
+        <w:rPr>
+          <w:b w:val="0"/>
+          <w:i w:val="0"/>
+        </w:rPr>
+        <w:t>Strategy proprietary; engineering details available in conversation.</w:t>
       </w:r>
     </w:p>
     <w:p>
@@ -986,7 +1159,7 @@
           <w:b w:val="0"/>
           <w:i w:val="0"/>
         </w:rPr>
-        <w:t>Claude Code, OpenAI Codex, Gemini CLI, Grok, Google Antigravity; used together in multi-agent workflows: worktree orchestration, review gates, MCP, browser automation, multi-device agent fleets, LLM fine-tuning, RAG</w:t>
+        <w:t>Claude Code, OpenAI Codex, Gemini CLI, Grok, Google Antigravity; used together in multi-agent workflows: worktree orchestration, review gates, MCP, browser automation, multi-device agent fleets, LLM fine-tuning, RAG, voice pipelines (STT/TTS)</w:t>
       </w:r>
     </w:p>
     <w:p>
@@ -1002,7 +1175,7 @@
           <w:b w:val="0"/>
           <w:i w:val="0"/>
         </w:rPr>
-        <w:t>Python, C, C++, PyTorch, Tensorflow, Java, Javascript, SQL, CUDA, Assembly</w:t>
+        <w:t>Python, C, C++, PyTorch, Tensorflow, scikit-learn, Java, Javascript, SQL, CUDA, Assembly</w:t>
       </w:r>
     </w:p>
     <w:p>
@@ -1018,7 +1191,7 @@
           <w:b w:val="0"/>
           <w:i w:val="0"/>
         </w:rPr>
-        <w:t>Kubernetes, Qiskit, Huggingface, Git</w:t>
+        <w:t>Huggingface, Git, WebRTC, ffmpeg, sherpa-onnx (speech recognition), Qiskit</w:t>
       </w:r>
     </w:p>
     <w:p>
@@ -1093,18 +1266,6 @@
     </w:p>
     <w:p>
       <w:pPr>
-        <w:spacing w:after="100"/>
-      </w:pPr>
-      <w:r>
-        <w:rPr>
-          <w:b w:val="0"/>
-          <w:i w:val="0"/>
-        </w:rPr>
-        <w:t xml:space="preserve">Xu, J., Wu, Y., Chen, S. Y.-C., Patten, S., Schweikert, C., &amp; Hsu, D.F. (2026). Diversity-Aware Ensemble of Quantum-Classical Models via Combinatorial Fusion. Proceedings of the IEEE International Conference on Quantum Computing and Engineering (QCE 2026), Quantum Applications track, Toronto (accepted, not yet published). </w:t>
-      </w:r>
-    </w:p>
-    <w:p>
-      <w:pPr>
         <w:keepNext/>
         <w:tabs>
           <w:tab w:pos="10080" w:val="right"/>
@@ -1152,57 +1313,6 @@
           <w:i w:val="0"/>
         </w:rPr>
         <w:t>Maps transformer weight super-blocks onto qubit registers and uses entanglement profiling (Von Neumann entropy across bipartitions) to derive non-uniform, entropy-aware tensor-network compression topologies, targeting 80%+ memory reduction with under 2% accuracy loss against SVD-LLM, ASVD, SparseGPT, and CompactifAI baselines.</w:t>
-      </w:r>
-    </w:p>
-    <w:p>
-      <w:pPr>
-        <w:keepNext/>
-        <w:tabs>
-          <w:tab w:pos="10080" w:val="right"/>
-        </w:tabs>
-        <w:spacing w:before="100" w:after="40"/>
-      </w:pPr>
-      <w:r>
-        <w:rPr>
-          <w:b/>
-          <w:i w:val="0"/>
-          <w:sz w:val="22"/>
-        </w:rPr>
-        <w:t>Research Team Lead, Laboratory of Informatics and Data Mining, Fordham</w:t>
-      </w:r>
-      <w:r>
-        <w:rPr>
-          <w:b w:val="0"/>
-          <w:i/>
-          <w:color w:val="444444"/>
-          <w:sz w:val="19"/>
-        </w:rPr>
-        <w:tab/>
-        <w:t>2026 - Present</w:t>
-      </w:r>
-    </w:p>
-    <w:p>
-      <w:pPr>
-        <w:pStyle w:val="ListBullet"/>
-      </w:pPr>
-      <w:r>
-        <w:rPr>
-          <w:b w:val="0"/>
-          <w:i w:val="0"/>
-        </w:rPr>
-        <w:t>Led the research team (Fordham LIDM students with Dr. Samuel Yen-Chi Chen, first author of the original QLSTM paper) building a reproducible quantum-classical Combinatorial Fusion Analysis pipeline: a 40-model pool of 26 quantum-circuit feature maps (including gradient-trained variational quantum classifiers) and 14 classical baselines, with cognitive-diversity-based model selection.</w:t>
-      </w:r>
-    </w:p>
-    <w:p>
-      <w:pPr>
-        <w:pStyle w:val="ListBullet"/>
-      </w:pPr>
-      <w:r>
-        <w:rPr>
-          <w:b w:val="0"/>
-          <w:i w:val="0"/>
-        </w:rPr>
-        <w:t>Work produced the accepted paper Diversity-Aware Ensemble of Quantum-Classical Models via Combinatorial Fusion (QCE 2026).</w:t>
       </w:r>
     </w:p>
     <w:sectPr>

</xml_diff>

<commit_message>
resume v6 (i resume pub)
</commit_message>
<xml_diff>
--- a/Sean_Patten_Resume.docx
+++ b/Sean_Patten_Resume.docx
@@ -171,7 +171,7 @@
           <w:i w:val="0"/>
           <w:sz w:val="22"/>
         </w:rPr>
-        <w:t>Research Intern, IBM</w:t>
+        <w:t>AI Research Intern, IBM</w:t>
       </w:r>
       <w:r>
         <w:rPr>
@@ -348,7 +348,7 @@
           <w:i w:val="0"/>
           <w:sz w:val="22"/>
         </w:rPr>
-        <w:t>AI Engineer Consultant, Aspire Aviation</w:t>
+        <w:t>AI Engineer, Aspire Aviation</w:t>
       </w:r>
       <w:r>
         <w:rPr>

</xml_diff>